<commit_message>
Italian Part 3: revise episodes 35-37 for continuity with 32-34
Co-Authored-By: Claude Opus 5.5 <noreply@anthropic.com>
Claude-Session: https://claude.ai/code/session_014Pwa4fJotSRvNewqVrvk7U
</commit_message>
<xml_diff>
--- a/business_it/part3/ep35_Un_difetto_di_due_millimetri.docx
+++ b/business_it/part3/ep35_Un_difetto_di_due_millimetri.docx
@@ -376,7 +376,7 @@
           <w:rFonts w:ascii="Calibri" w:hAnsi="Calibri" w:eastAsia="Malgun Gothic"/>
           <w:sz w:val="20"/>
         </w:rPr>
-        <w:t>[공방, 이름만] Renzo Paoli (렌초, 72) — 장인. 3월엔 메종 바렌 시제품을 만드느라 문을 닫고 일했다. / Simone (시모네, 19) — 1년 차 견습생. 가장자리 칠을 혼자 맡았던 주가 있었다. / Loredana (로레다나) — 재봉 라인 베테랑.</w:t>
+        <w:t>[공방, 이름만] Renzo Paoli (렌초, 72) — 장인. 4월 14일 주에는 서울 선적분을 하나하나 검사하느라 포장대에 붙어 있었다. / Simone (시모네, 19) — 1년 차 견습생. 그 주에 사이트용 가방('14일 로트')의 가장자리 칠을 혼자 맡았다. / Loredana (로레다나) — 재봉 라인 베테랑.</w:t>
       </w:r>
     </w:p>
     <w:p>
@@ -400,7 +400,7 @@
           <w:rFonts w:ascii="Calibri" w:hAnsi="Calibri" w:eastAsia="Malgun Gothic"/>
           <w:sz w:val="20"/>
         </w:rPr>
-        <w:t>[사외] Sato Misaki (사토 미사키) — « Kōbō »의 검품 담당이자 이탈리아 브랜드 담당. 볼로냐에서 1년 공부했다. 흰 면장갑과 캘리퍼로 2밀리미터를 찾아내는 사람.</w:t>
+        <w:t>[사외] Sato Misaki (사토 미사키) — « Kōbō »의 검품 담당이자 이탈리아 브랜드 담당. 피렌체에서 2년 동안 종이 복원을 공부했다. 샘플이 아니라 한 점 한 점, 북쪽 창의 빛 아래서 검품한다. 흰 면장갑과 캘리퍼로 2밀리미터를 찾아내는 사람.</w:t>
       </w:r>
     </w:p>
     <w:p>
@@ -476,7 +476,7 @@
           <w:color w:val="666666"/>
           <w:sz w:val="19"/>
         </w:rPr>
-        <w:t>Una stanza bianca, senza finestre, dietro il negozio. Un tavolo luminoso, un calibro, un righello d'acciaio, una lente. Sulle mensole, in fila, le quaranta borse arrivate da Scandicci per il controllo, ognuna con il suo cartellino scritto a mano. Sato Misaki, guanti bianchi di cotone, aspetta in piedi. Watanabe è seduto in un angolo, le mani sulle ginocchia.</w:t>
+        <w:t>Una stanza bianca dietro il negozio, con un'unica finestra a nord: luce fredda, senza ombre. Un tavolo luminoso, un calibro, un righello d'acciaio, una lente. Sulle mensole, in fila, le quaranta borse vere di produzione, il « lotto del quattordici », arrivate ieri sera da Scandicci nella scatola su cui Filippo ha scritto « Come sono. F. », ognuna con il suo cartellino scritto a mano. Sato Misaki, guanti bianchi di cotone, aspetta in piedi. Watanabe è seduto in un angolo, le mani sulle ginocchia.</w:t>
       </w:r>
     </w:p>
     <w:p>
@@ -2368,7 +2368,7 @@
           <w:sz w:val="22"/>
         </w:rPr>
         <w:tab/>
-        <w:t>Le sei borse ve le restituisco, con i cartellini. Le altre trentaquattro restano qui, se siete d'accordo.</w:t>
+        <w:t>Le sei borse tornano in Italia, a vostre spese, come dice l'accordo. Con i cartellini. Le altre trentaquattro restano qui, se siete d'accordo.</w:t>
       </w:r>
     </w:p>
     <w:p>
@@ -2881,7 +2881,7 @@
           <w:sz w:val="22"/>
         </w:rPr>
         <w:tab/>
-        <w:t>No. Noi le abbiamo fatte di corsa. Ti ricordi marzo? Le sessanta di Seul, il prototipo di Parigi, le ragazze che tagliavano fino alle sette.</w:t>
+        <w:t>No. Noi le abbiamo fatte di corsa. Ti ricordi la settimana del quattordici aprile? Le sessanta di Seul da imballare, la spedizione, le borse del sito da finire, le ragazze che lavoravano fino alle sette.</w:t>
       </w:r>
     </w:p>
     <w:p>
@@ -2907,7 +2907,7 @@
           <w:sz w:val="22"/>
         </w:rPr>
         <w:tab/>
-        <w:t>Mi ricordo. E Renzo che faceva il prototipo con la porta chiusa.</w:t>
+        <w:t>Mi ricordo. E Renzo che controllava le borse di Seul una per una, al banco dell'imballaggio.</w:t>
       </w:r>
     </w:p>
     <w:p>
@@ -8096,7 +8096,7 @@
           <w:color w:val="666666"/>
           <w:sz w:val="19"/>
         </w:rPr>
-        <w:t>가게 뒤편의 창 없는 하얀 방. 라이트 테이블, 캘리퍼, 강철 자, 확대경. 선반 위에는 검품을 위해 스칸디치에서 도착한 가방 마흔 개가 줄지어 있다. 가방마다 손글씨 택이 달려 있다. 흰 면장갑을 낀 사토 미사키가 서서 기다린다. 와타나베는 구석에 앉아 두 손을 무릎에 올려놓고 있다.</w:t>
+        <w:t>가게 뒤편의 하얀 방. 북쪽으로 난 창 하나뿐이라 그림자 없는 차가운 빛이 든다. 라이트 테이블, 캘리퍼, 강철 자, 확대경. 선반 위에는 어젯밤 스칸디치에서 도착한 실제 생산품 가방 마흔 개, '14일 로트'가 줄지어 있다. 필리포가 상자에 '있는 그대로. F.'라고 써 보낸 것이다. 가방마다 손글씨 택이 달려 있다. 흰 면장갑을 낀 사토 미사키가 서서 기다린다. 와타나베는 구석에 앉아 두 손을 무릎에 올려놓고 있다.</w:t>
       </w:r>
     </w:p>
     <w:p>
@@ -9989,7 +9989,7 @@
           <w:sz w:val="21"/>
         </w:rPr>
         <w:tab/>
-        <w:t>여섯 개는 택과 함께 돌려드릴게요. 나머지 서른네 개는 동의하시면 여기 남겨 두고요.</w:t>
+        <w:t>여섯 개는 합의대로 그쪽 비용으로 이탈리아에 돌아갑니다. 택도 함께요. 나머지 서른네 개는 동의하시면 여기 남겨 두고요.</w:t>
       </w:r>
     </w:p>
     <w:p>
@@ -10503,7 +10503,7 @@
           <w:sz w:val="21"/>
         </w:rPr>
         <w:tab/>
-        <w:t>아니. 우린 급하게 만들었어. 3월 기억나? 서울용 예순 개, 파리 시제품, 일곱 시까지 재단하던 사람들.</w:t>
+        <w:t>아니. 우린 급하게 만들었어. 4월 14일 주 기억나? 포장해야 할 서울용 예순 개, 선적, 마무리해야 할 사이트용 가방들, 일곱 시까지 일하던 사람들.</w:t>
       </w:r>
     </w:p>
     <w:p>
@@ -10529,7 +10529,7 @@
           <w:sz w:val="21"/>
         </w:rPr>
         <w:tab/>
-        <w:t>기억나. 그리고 문 닫아 놓고 시제품 만들던 렌초 씨.</w:t>
+        <w:t>기억나. 그리고 포장대에서 서울용 가방을 하나하나 검사하던 렌초 씨.</w:t>
       </w:r>
     </w:p>
     <w:p>

</xml_diff>